<commit_message>
Refresh capstone evidence and version both app walkthroughs
Lesson: Regenerate submission files from shared facts and verify the rendered result.
</commit_message>
<xml_diff>
--- a/submission/artifacts/DragonWings_Faculty_Showcase_Preparation.docx
+++ b/submission/artifacts/DragonWings_Faculty_Showcase_Preparation.docx
@@ -82,7 +82,7 @@
     </w:p>
     <w:p>
       <w:r>
-        <w:t>Gemma 3 4B was available locally through Ollama and fit the minimal local prototype. This was an implementation choice, not the result of a comparative model benchmark. Generator and critic have distinct responsibilities. The optional interpreter lets me test added complexity. One real pair increased calls from four to six and latency from about 53 to 70 seconds, with no demonstrated quality improvement, so the third role defaults off.</w:t>
+        <w:t>Gemma 3 4B was available locally through Ollama and fit the minimal prototype. It was an implementation choice, not a benchmark winner. Environment settings now support OpenAI and Claude with the same bounded contracts; their SDK paths use simulated HTTP tests, with live comparisons still pending. Generator and critic have distinct roles. One real third-role trial increased calls from four to six and latency from about 53 to 70 seconds without an established quality benefit, so that role defaults off.</w:t>
       </w:r>
     </w:p>
     <w:p>
@@ -129,7 +129,7 @@
     </w:p>
     <w:p>
       <w:r>
-        <w:t>Forty unit and integration tests plus ten Chromium checks support the tested calculations, workflow boundaries, persistence, retrieval, and UI. Required tests use model doubles. Separate actual-model runs demonstrate the live path. One outcome sample and one sequential agent pair are too small to establish forecast accuracy or model quality. I would next use held-out outcomes, a code-only guidance baseline, repeated order-balanced model comparisons, and human ratings of factual support and usefulness.</w:t>
+        <w:t>Forty-four unit and integration tests plus thirteen Chromium checks support the tested calculations, workflow boundaries, persistence, retrieval, and UI. Required tests use model doubles. Separate actual-model runs demonstrate the live path. One outcome sample and one sequential agent pair are too small to establish forecast accuracy or model quality. I would next use held-out outcomes, a code-only guidance baseline, repeated order-balanced model comparisons, and human ratings of factual support and usefulness.</w:t>
       </w:r>
     </w:p>
     <w:p>

</xml_diff>

<commit_message>
Refresh capstone evidence and version both app walkthroughs (#16)
Lesson: Regenerate submission files from shared facts and verify the rendered result.
</commit_message>
<xml_diff>
--- a/submission/artifacts/DragonWings_Faculty_Showcase_Preparation.docx
+++ b/submission/artifacts/DragonWings_Faculty_Showcase_Preparation.docx
@@ -82,7 +82,7 @@
     </w:p>
     <w:p>
       <w:r>
-        <w:t>Gemma 3 4B was available locally through Ollama and fit the minimal local prototype. This was an implementation choice, not the result of a comparative model benchmark. Generator and critic have distinct responsibilities. The optional interpreter lets me test added complexity. One real pair increased calls from four to six and latency from about 53 to 70 seconds, with no demonstrated quality improvement, so the third role defaults off.</w:t>
+        <w:t>Gemma 3 4B was available locally through Ollama and fit the minimal prototype. It was an implementation choice, not a benchmark winner. Environment settings now support OpenAI and Claude with the same bounded contracts; their SDK paths use simulated HTTP tests, with live comparisons still pending. Generator and critic have distinct roles. One real third-role trial increased calls from four to six and latency from about 53 to 70 seconds without an established quality benefit, so that role defaults off.</w:t>
       </w:r>
     </w:p>
     <w:p>
@@ -129,7 +129,7 @@
     </w:p>
     <w:p>
       <w:r>
-        <w:t>Forty unit and integration tests plus ten Chromium checks support the tested calculations, workflow boundaries, persistence, retrieval, and UI. Required tests use model doubles. Separate actual-model runs demonstrate the live path. One outcome sample and one sequential agent pair are too small to establish forecast accuracy or model quality. I would next use held-out outcomes, a code-only guidance baseline, repeated order-balanced model comparisons, and human ratings of factual support and usefulness.</w:t>
+        <w:t>Forty-four unit and integration tests plus thirteen Chromium checks support the tested calculations, workflow boundaries, persistence, retrieval, and UI. Required tests use model doubles. Separate actual-model runs demonstrate the live path. One outcome sample and one sequential agent pair are too small to establish forecast accuracy or model quality. I would next use held-out outcomes, a code-only guidance baseline, repeated order-balanced model comparisons, and human ratings of factual support and usefulness.</w:t>
       </w:r>
     </w:p>
     <w:p>

</xml_diff>